<commit_message>
Complete RC10 question scoring, media import and release checks
</commit_message>
<xml_diff>
--- a/public/question-templates/online-week.docx
+++ b/public/question-templates/online-week.docx
@@ -244,6 +244,11 @@
     <w:p>
       <w:r>
         <w:t>Để dùng hình ảnh hoặc âm thanh, tải tệp riêng trong ứng dụng rồi ghi đúng tên tệp vào imageFile hoặc audioFile. Hình ảnh cần imageAlt. Âm thanh cần audioTranscript. Không nhúng tệp vào Word. source và rights ghi nguồn cùng quyền sử dụng của nội dung.</w:t>
+      </w:r>
+    </w:p>
+    <w:p>
+      <w:r>
+        <w:t>allowedGameIds giới hạn trò cho từng câu, có thể để trống. Dùng mã math-quest, memory-match, sentence-builder, word-connect, sequence-trail và tách bằng dấu |. Ví dụ memory-match|word-connect. Bộ chỉ mở trò chung cho tất cả câu và vẫn kiểm tra cấu trúc dữ liệu.</w:t>
       </w:r>
     </w:p>
     <w:p>
@@ -1469,7 +1474,7 @@
                 <w:rFonts w:ascii="Arial" w:hAnsi="Arial"/>
                 <w:sz w:val="20"/>
               </w:rPr>
-              <w:t>prompt</w:t>
+              <w:t>allowedGameIds</w:t>
             </w:r>
           </w:p>
         </w:tc>
@@ -1534,7 +1539,7 @@
                 <w:rFonts w:ascii="Arial" w:hAnsi="Arial"/>
                 <w:sz w:val="20"/>
               </w:rPr>
-              <w:t>A</w:t>
+              <w:t>prompt</w:t>
             </w:r>
           </w:p>
         </w:tc>
@@ -1599,7 +1604,7 @@
                 <w:rFonts w:ascii="Arial" w:hAnsi="Arial"/>
                 <w:sz w:val="20"/>
               </w:rPr>
-              <w:t>B</w:t>
+              <w:t>A</w:t>
             </w:r>
           </w:p>
         </w:tc>
@@ -1664,7 +1669,7 @@
                 <w:rFonts w:ascii="Arial" w:hAnsi="Arial"/>
                 <w:sz w:val="20"/>
               </w:rPr>
-              <w:t>C</w:t>
+              <w:t>B</w:t>
             </w:r>
           </w:p>
         </w:tc>
@@ -1729,7 +1734,7 @@
                 <w:rFonts w:ascii="Arial" w:hAnsi="Arial"/>
                 <w:sz w:val="20"/>
               </w:rPr>
-              <w:t>D</w:t>
+              <w:t>C</w:t>
             </w:r>
           </w:p>
         </w:tc>
@@ -1794,7 +1799,7 @@
                 <w:rFonts w:ascii="Arial" w:hAnsi="Arial"/>
                 <w:sz w:val="20"/>
               </w:rPr>
-              <w:t>answer</w:t>
+              <w:t>D</w:t>
             </w:r>
           </w:p>
         </w:tc>
@@ -1859,7 +1864,7 @@
                 <w:rFonts w:ascii="Arial" w:hAnsi="Arial"/>
                 <w:sz w:val="20"/>
               </w:rPr>
-              <w:t>explanation</w:t>
+              <w:t>answer</w:t>
             </w:r>
           </w:p>
         </w:tc>
@@ -1924,7 +1929,7 @@
                 <w:rFonts w:ascii="Arial" w:hAnsi="Arial"/>
                 <w:sz w:val="20"/>
               </w:rPr>
-              <w:t>imageFile</w:t>
+              <w:t>explanation</w:t>
             </w:r>
           </w:p>
         </w:tc>
@@ -1989,7 +1994,7 @@
                 <w:rFonts w:ascii="Arial" w:hAnsi="Arial"/>
                 <w:sz w:val="20"/>
               </w:rPr>
-              <w:t>imageAlt</w:t>
+              <w:t>imageFile</w:t>
             </w:r>
           </w:p>
         </w:tc>
@@ -2054,7 +2059,7 @@
                 <w:rFonts w:ascii="Arial" w:hAnsi="Arial"/>
                 <w:sz w:val="20"/>
               </w:rPr>
-              <w:t>audioFile</w:t>
+              <w:t>imageAlt</w:t>
             </w:r>
           </w:p>
         </w:tc>
@@ -2119,7 +2124,7 @@
                 <w:rFonts w:ascii="Arial" w:hAnsi="Arial"/>
                 <w:sz w:val="20"/>
               </w:rPr>
-              <w:t>audioTranscript</w:t>
+              <w:t>audioFile</w:t>
             </w:r>
           </w:p>
         </w:tc>
@@ -2184,7 +2189,7 @@
                 <w:rFonts w:ascii="Arial" w:hAnsi="Arial"/>
                 <w:sz w:val="20"/>
               </w:rPr>
-              <w:t>source</w:t>
+              <w:t>audioTranscript</w:t>
             </w:r>
           </w:p>
         </w:tc>
@@ -2249,6 +2254,71 @@
                 <w:rFonts w:ascii="Arial" w:hAnsi="Arial"/>
                 <w:sz w:val="20"/>
               </w:rPr>
+              <w:t>source</w:t>
+            </w:r>
+          </w:p>
+        </w:tc>
+        <w:tc>
+          <w:tcPr>
+            <w:tcW w:type="dxa" w:w="7301"/>
+            <w:vAlign w:val="center"/>
+            <w:tcBorders>
+              <w:top w:val="single" w:sz="4" w:color="D9D9D9"/>
+              <w:left w:val="single" w:sz="4" w:color="D9D9D9"/>
+              <w:bottom w:val="single" w:sz="4" w:color="D9D9D9"/>
+              <w:right w:val="single" w:sz="4" w:color="D9D9D9"/>
+            </w:tcBorders>
+            <w:tcMar>
+              <w:top w:w="70" w:type="dxa"/>
+              <w:left w:w="70" w:type="dxa"/>
+              <w:bottom w:w="70" w:type="dxa"/>
+              <w:right w:w="70" w:type="dxa"/>
+            </w:tcMar>
+          </w:tcPr>
+          <w:p>
+            <w:pPr>
+              <w:spacing w:after="40" w:before="40"/>
+            </w:pPr>
+            <w:r>
+              <w:rPr>
+                <w:rFonts w:ascii="Arial" w:hAnsi="Arial"/>
+                <w:sz w:val="20"/>
+              </w:rPr>
+            </w:r>
+          </w:p>
+        </w:tc>
+      </w:tr>
+      <w:tr>
+        <w:trPr>
+          <w:cantSplit/>
+        </w:trPr>
+        <w:tc>
+          <w:tcPr>
+            <w:tcW w:type="dxa" w:w="2592"/>
+            <w:vAlign w:val="center"/>
+            <w:tcBorders>
+              <w:top w:val="single" w:sz="4" w:color="D9D9D9"/>
+              <w:left w:val="single" w:sz="4" w:color="D9D9D9"/>
+              <w:bottom w:val="single" w:sz="4" w:color="D9D9D9"/>
+              <w:right w:val="single" w:sz="4" w:color="D9D9D9"/>
+            </w:tcBorders>
+            <w:tcMar>
+              <w:top w:w="70" w:type="dxa"/>
+              <w:left w:w="70" w:type="dxa"/>
+              <w:bottom w:w="70" w:type="dxa"/>
+              <w:right w:w="70" w:type="dxa"/>
+            </w:tcMar>
+            <w:shd w:fill="F1F4F8"/>
+          </w:tcPr>
+          <w:p>
+            <w:pPr>
+              <w:spacing w:after="40" w:before="40"/>
+            </w:pPr>
+            <w:r>
+              <w:rPr>
+                <w:rFonts w:ascii="Arial" w:hAnsi="Arial"/>
+                <w:sz w:val="20"/>
+              </w:rPr>
               <w:t>rights</w:t>
             </w:r>
           </w:p>
@@ -2269,6 +2339,7 @@
               <w:bottom w:w="70" w:type="dxa"/>
               <w:right w:w="70" w:type="dxa"/>
             </w:tcMar>
+            <w:shd w:fill="F1F4F8"/>
           </w:tcPr>
           <w:p>
             <w:pPr>
@@ -2882,7 +2953,7 @@
                 <w:rFonts w:ascii="Arial" w:hAnsi="Arial"/>
                 <w:sz w:val="20"/>
               </w:rPr>
-              <w:t>left</w:t>
+              <w:t>allowedGameIds</w:t>
             </w:r>
           </w:p>
         </w:tc>
@@ -2947,7 +3018,7 @@
                 <w:rFonts w:ascii="Arial" w:hAnsi="Arial"/>
                 <w:sz w:val="20"/>
               </w:rPr>
-              <w:t>right</w:t>
+              <w:t>left</w:t>
             </w:r>
           </w:p>
         </w:tc>
@@ -3012,7 +3083,7 @@
                 <w:rFonts w:ascii="Arial" w:hAnsi="Arial"/>
                 <w:sz w:val="20"/>
               </w:rPr>
-              <w:t>imageFile</w:t>
+              <w:t>right</w:t>
             </w:r>
           </w:p>
         </w:tc>
@@ -3077,7 +3148,7 @@
                 <w:rFonts w:ascii="Arial" w:hAnsi="Arial"/>
                 <w:sz w:val="20"/>
               </w:rPr>
-              <w:t>imageAlt</w:t>
+              <w:t>imageFile</w:t>
             </w:r>
           </w:p>
         </w:tc>
@@ -3142,7 +3213,7 @@
                 <w:rFonts w:ascii="Arial" w:hAnsi="Arial"/>
                 <w:sz w:val="20"/>
               </w:rPr>
-              <w:t>audioFile</w:t>
+              <w:t>imageAlt</w:t>
             </w:r>
           </w:p>
         </w:tc>
@@ -3207,7 +3278,7 @@
                 <w:rFonts w:ascii="Arial" w:hAnsi="Arial"/>
                 <w:sz w:val="20"/>
               </w:rPr>
-              <w:t>audioTranscript</w:t>
+              <w:t>audioFile</w:t>
             </w:r>
           </w:p>
         </w:tc>
@@ -3272,7 +3343,7 @@
                 <w:rFonts w:ascii="Arial" w:hAnsi="Arial"/>
                 <w:sz w:val="20"/>
               </w:rPr>
-              <w:t>source</w:t>
+              <w:t>audioTranscript</w:t>
             </w:r>
           </w:p>
         </w:tc>
@@ -3337,6 +3408,71 @@
                 <w:rFonts w:ascii="Arial" w:hAnsi="Arial"/>
                 <w:sz w:val="20"/>
               </w:rPr>
+              <w:t>source</w:t>
+            </w:r>
+          </w:p>
+        </w:tc>
+        <w:tc>
+          <w:tcPr>
+            <w:tcW w:type="dxa" w:w="7301"/>
+            <w:vAlign w:val="center"/>
+            <w:tcBorders>
+              <w:top w:val="single" w:sz="4" w:color="D9D9D9"/>
+              <w:left w:val="single" w:sz="4" w:color="D9D9D9"/>
+              <w:bottom w:val="single" w:sz="4" w:color="D9D9D9"/>
+              <w:right w:val="single" w:sz="4" w:color="D9D9D9"/>
+            </w:tcBorders>
+            <w:tcMar>
+              <w:top w:w="70" w:type="dxa"/>
+              <w:left w:w="70" w:type="dxa"/>
+              <w:bottom w:w="70" w:type="dxa"/>
+              <w:right w:w="70" w:type="dxa"/>
+            </w:tcMar>
+            <w:shd w:fill="F1F4F8"/>
+          </w:tcPr>
+          <w:p>
+            <w:pPr>
+              <w:spacing w:after="40" w:before="40"/>
+            </w:pPr>
+            <w:r>
+              <w:rPr>
+                <w:rFonts w:ascii="Arial" w:hAnsi="Arial"/>
+                <w:sz w:val="20"/>
+              </w:rPr>
+            </w:r>
+          </w:p>
+        </w:tc>
+      </w:tr>
+      <w:tr>
+        <w:trPr>
+          <w:cantSplit/>
+        </w:trPr>
+        <w:tc>
+          <w:tcPr>
+            <w:tcW w:type="dxa" w:w="2592"/>
+            <w:vAlign w:val="center"/>
+            <w:tcBorders>
+              <w:top w:val="single" w:sz="4" w:color="D9D9D9"/>
+              <w:left w:val="single" w:sz="4" w:color="D9D9D9"/>
+              <w:bottom w:val="single" w:sz="4" w:color="D9D9D9"/>
+              <w:right w:val="single" w:sz="4" w:color="D9D9D9"/>
+            </w:tcBorders>
+            <w:tcMar>
+              <w:top w:w="70" w:type="dxa"/>
+              <w:left w:w="70" w:type="dxa"/>
+              <w:bottom w:w="70" w:type="dxa"/>
+              <w:right w:w="70" w:type="dxa"/>
+            </w:tcMar>
+          </w:tcPr>
+          <w:p>
+            <w:pPr>
+              <w:spacing w:after="40" w:before="40"/>
+            </w:pPr>
+            <w:r>
+              <w:rPr>
+                <w:rFonts w:ascii="Arial" w:hAnsi="Arial"/>
+                <w:sz w:val="20"/>
+              </w:rPr>
               <w:t>rights</w:t>
             </w:r>
           </w:p>
@@ -3357,7 +3493,6 @@
               <w:bottom w:w="70" w:type="dxa"/>
               <w:right w:w="70" w:type="dxa"/>
             </w:tcMar>
-            <w:shd w:fill="F1F4F8"/>
           </w:tcPr>
           <w:p>
             <w:pPr>
@@ -3971,7 +4106,7 @@
                 <w:rFonts w:ascii="Arial" w:hAnsi="Arial"/>
                 <w:sz w:val="20"/>
               </w:rPr>
-              <w:t>prompt</w:t>
+              <w:t>allowedGameIds</w:t>
             </w:r>
           </w:p>
         </w:tc>
@@ -4036,7 +4171,7 @@
                 <w:rFonts w:ascii="Arial" w:hAnsi="Arial"/>
                 <w:sz w:val="20"/>
               </w:rPr>
-              <w:t>answer</w:t>
+              <w:t>prompt</w:t>
             </w:r>
           </w:p>
         </w:tc>
@@ -4101,7 +4236,7 @@
                 <w:rFonts w:ascii="Arial" w:hAnsi="Arial"/>
                 <w:sz w:val="20"/>
               </w:rPr>
-              <w:t>words</w:t>
+              <w:t>answer</w:t>
             </w:r>
           </w:p>
         </w:tc>
@@ -4166,7 +4301,7 @@
                 <w:rFonts w:ascii="Arial" w:hAnsi="Arial"/>
                 <w:sz w:val="20"/>
               </w:rPr>
-              <w:t>hint</w:t>
+              <w:t>words</w:t>
             </w:r>
           </w:p>
         </w:tc>
@@ -4231,7 +4366,7 @@
                 <w:rFonts w:ascii="Arial" w:hAnsi="Arial"/>
                 <w:sz w:val="20"/>
               </w:rPr>
-              <w:t>imageFile</w:t>
+              <w:t>hint</w:t>
             </w:r>
           </w:p>
         </w:tc>
@@ -4296,7 +4431,7 @@
                 <w:rFonts w:ascii="Arial" w:hAnsi="Arial"/>
                 <w:sz w:val="20"/>
               </w:rPr>
-              <w:t>imageAlt</w:t>
+              <w:t>imageFile</w:t>
             </w:r>
           </w:p>
         </w:tc>
@@ -4361,7 +4496,7 @@
                 <w:rFonts w:ascii="Arial" w:hAnsi="Arial"/>
                 <w:sz w:val="20"/>
               </w:rPr>
-              <w:t>audioFile</w:t>
+              <w:t>imageAlt</w:t>
             </w:r>
           </w:p>
         </w:tc>
@@ -4426,7 +4561,7 @@
                 <w:rFonts w:ascii="Arial" w:hAnsi="Arial"/>
                 <w:sz w:val="20"/>
               </w:rPr>
-              <w:t>audioTranscript</w:t>
+              <w:t>audioFile</w:t>
             </w:r>
           </w:p>
         </w:tc>
@@ -4491,7 +4626,7 @@
                 <w:rFonts w:ascii="Arial" w:hAnsi="Arial"/>
                 <w:sz w:val="20"/>
               </w:rPr>
-              <w:t>source</w:t>
+              <w:t>audioTranscript</w:t>
             </w:r>
           </w:p>
         </w:tc>
@@ -4556,6 +4691,71 @@
                 <w:rFonts w:ascii="Arial" w:hAnsi="Arial"/>
                 <w:sz w:val="20"/>
               </w:rPr>
+              <w:t>source</w:t>
+            </w:r>
+          </w:p>
+        </w:tc>
+        <w:tc>
+          <w:tcPr>
+            <w:tcW w:type="dxa" w:w="7301"/>
+            <w:vAlign w:val="center"/>
+            <w:tcBorders>
+              <w:top w:val="single" w:sz="4" w:color="D9D9D9"/>
+              <w:left w:val="single" w:sz="4" w:color="D9D9D9"/>
+              <w:bottom w:val="single" w:sz="4" w:color="D9D9D9"/>
+              <w:right w:val="single" w:sz="4" w:color="D9D9D9"/>
+            </w:tcBorders>
+            <w:tcMar>
+              <w:top w:w="70" w:type="dxa"/>
+              <w:left w:w="70" w:type="dxa"/>
+              <w:bottom w:w="70" w:type="dxa"/>
+              <w:right w:w="70" w:type="dxa"/>
+            </w:tcMar>
+            <w:shd w:fill="F1F4F8"/>
+          </w:tcPr>
+          <w:p>
+            <w:pPr>
+              <w:spacing w:after="40" w:before="40"/>
+            </w:pPr>
+            <w:r>
+              <w:rPr>
+                <w:rFonts w:ascii="Arial" w:hAnsi="Arial"/>
+                <w:sz w:val="20"/>
+              </w:rPr>
+            </w:r>
+          </w:p>
+        </w:tc>
+      </w:tr>
+      <w:tr>
+        <w:trPr>
+          <w:cantSplit/>
+        </w:trPr>
+        <w:tc>
+          <w:tcPr>
+            <w:tcW w:type="dxa" w:w="2592"/>
+            <w:vAlign w:val="center"/>
+            <w:tcBorders>
+              <w:top w:val="single" w:sz="4" w:color="D9D9D9"/>
+              <w:left w:val="single" w:sz="4" w:color="D9D9D9"/>
+              <w:bottom w:val="single" w:sz="4" w:color="D9D9D9"/>
+              <w:right w:val="single" w:sz="4" w:color="D9D9D9"/>
+            </w:tcBorders>
+            <w:tcMar>
+              <w:top w:w="70" w:type="dxa"/>
+              <w:left w:w="70" w:type="dxa"/>
+              <w:bottom w:w="70" w:type="dxa"/>
+              <w:right w:w="70" w:type="dxa"/>
+            </w:tcMar>
+          </w:tcPr>
+          <w:p>
+            <w:pPr>
+              <w:spacing w:after="40" w:before="40"/>
+            </w:pPr>
+            <w:r>
+              <w:rPr>
+                <w:rFonts w:ascii="Arial" w:hAnsi="Arial"/>
+                <w:sz w:val="20"/>
+              </w:rPr>
               <w:t>rights</w:t>
             </w:r>
           </w:p>
@@ -4576,7 +4776,6 @@
               <w:bottom w:w="70" w:type="dxa"/>
               <w:right w:w="70" w:type="dxa"/>
             </w:tcMar>
-            <w:shd w:fill="F1F4F8"/>
           </w:tcPr>
           <w:p>
             <w:pPr>
@@ -5190,7 +5389,7 @@
                 <w:rFonts w:ascii="Arial" w:hAnsi="Arial"/>
                 <w:sz w:val="20"/>
               </w:rPr>
-              <w:t>prompt</w:t>
+              <w:t>allowedGameIds</w:t>
             </w:r>
           </w:p>
         </w:tc>
@@ -5255,7 +5454,7 @@
                 <w:rFonts w:ascii="Arial" w:hAnsi="Arial"/>
                 <w:sz w:val="20"/>
               </w:rPr>
-              <w:t>answer</w:t>
+              <w:t>prompt</w:t>
             </w:r>
           </w:p>
         </w:tc>
@@ -5320,7 +5519,7 @@
                 <w:rFonts w:ascii="Arial" w:hAnsi="Arial"/>
                 <w:sz w:val="20"/>
               </w:rPr>
-              <w:t>unit</w:t>
+              <w:t>answer</w:t>
             </w:r>
           </w:p>
         </w:tc>
@@ -5385,7 +5584,7 @@
                 <w:rFonts w:ascii="Arial" w:hAnsi="Arial"/>
                 <w:sz w:val="20"/>
               </w:rPr>
-              <w:t>hint</w:t>
+              <w:t>unit</w:t>
             </w:r>
           </w:p>
         </w:tc>
@@ -5450,7 +5649,7 @@
                 <w:rFonts w:ascii="Arial" w:hAnsi="Arial"/>
                 <w:sz w:val="20"/>
               </w:rPr>
-              <w:t>explanation</w:t>
+              <w:t>hint</w:t>
             </w:r>
           </w:p>
         </w:tc>
@@ -5515,7 +5714,7 @@
                 <w:rFonts w:ascii="Arial" w:hAnsi="Arial"/>
                 <w:sz w:val="20"/>
               </w:rPr>
-              <w:t>imageFile</w:t>
+              <w:t>explanation</w:t>
             </w:r>
           </w:p>
         </w:tc>
@@ -5580,7 +5779,7 @@
                 <w:rFonts w:ascii="Arial" w:hAnsi="Arial"/>
                 <w:sz w:val="20"/>
               </w:rPr>
-              <w:t>imageAlt</w:t>
+              <w:t>imageFile</w:t>
             </w:r>
           </w:p>
         </w:tc>
@@ -5645,7 +5844,7 @@
                 <w:rFonts w:ascii="Arial" w:hAnsi="Arial"/>
                 <w:sz w:val="20"/>
               </w:rPr>
-              <w:t>audioFile</w:t>
+              <w:t>imageAlt</w:t>
             </w:r>
           </w:p>
         </w:tc>
@@ -5710,7 +5909,7 @@
                 <w:rFonts w:ascii="Arial" w:hAnsi="Arial"/>
                 <w:sz w:val="20"/>
               </w:rPr>
-              <w:t>audioTranscript</w:t>
+              <w:t>audioFile</w:t>
             </w:r>
           </w:p>
         </w:tc>
@@ -5775,7 +5974,7 @@
                 <w:rFonts w:ascii="Arial" w:hAnsi="Arial"/>
                 <w:sz w:val="20"/>
               </w:rPr>
-              <w:t>source</w:t>
+              <w:t>audioTranscript</w:t>
             </w:r>
           </w:p>
         </w:tc>
@@ -5840,6 +6039,71 @@
                 <w:rFonts w:ascii="Arial" w:hAnsi="Arial"/>
                 <w:sz w:val="20"/>
               </w:rPr>
+              <w:t>source</w:t>
+            </w:r>
+          </w:p>
+        </w:tc>
+        <w:tc>
+          <w:tcPr>
+            <w:tcW w:type="dxa" w:w="7301"/>
+            <w:vAlign w:val="center"/>
+            <w:tcBorders>
+              <w:top w:val="single" w:sz="4" w:color="D9D9D9"/>
+              <w:left w:val="single" w:sz="4" w:color="D9D9D9"/>
+              <w:bottom w:val="single" w:sz="4" w:color="D9D9D9"/>
+              <w:right w:val="single" w:sz="4" w:color="D9D9D9"/>
+            </w:tcBorders>
+            <w:tcMar>
+              <w:top w:w="70" w:type="dxa"/>
+              <w:left w:w="70" w:type="dxa"/>
+              <w:bottom w:w="70" w:type="dxa"/>
+              <w:right w:w="70" w:type="dxa"/>
+            </w:tcMar>
+          </w:tcPr>
+          <w:p>
+            <w:pPr>
+              <w:spacing w:after="40" w:before="40"/>
+            </w:pPr>
+            <w:r>
+              <w:rPr>
+                <w:rFonts w:ascii="Arial" w:hAnsi="Arial"/>
+                <w:sz w:val="20"/>
+              </w:rPr>
+            </w:r>
+          </w:p>
+        </w:tc>
+      </w:tr>
+      <w:tr>
+        <w:trPr>
+          <w:cantSplit/>
+        </w:trPr>
+        <w:tc>
+          <w:tcPr>
+            <w:tcW w:type="dxa" w:w="2592"/>
+            <w:vAlign w:val="center"/>
+            <w:tcBorders>
+              <w:top w:val="single" w:sz="4" w:color="D9D9D9"/>
+              <w:left w:val="single" w:sz="4" w:color="D9D9D9"/>
+              <w:bottom w:val="single" w:sz="4" w:color="D9D9D9"/>
+              <w:right w:val="single" w:sz="4" w:color="D9D9D9"/>
+            </w:tcBorders>
+            <w:tcMar>
+              <w:top w:w="70" w:type="dxa"/>
+              <w:left w:w="70" w:type="dxa"/>
+              <w:bottom w:w="70" w:type="dxa"/>
+              <w:right w:w="70" w:type="dxa"/>
+            </w:tcMar>
+            <w:shd w:fill="F1F4F8"/>
+          </w:tcPr>
+          <w:p>
+            <w:pPr>
+              <w:spacing w:after="40" w:before="40"/>
+            </w:pPr>
+            <w:r>
+              <w:rPr>
+                <w:rFonts w:ascii="Arial" w:hAnsi="Arial"/>
+                <w:sz w:val="20"/>
+              </w:rPr>
               <w:t>rights</w:t>
             </w:r>
           </w:p>
@@ -5860,6 +6124,7 @@
               <w:bottom w:w="70" w:type="dxa"/>
               <w:right w:w="70" w:type="dxa"/>
             </w:tcMar>
+            <w:shd w:fill="F1F4F8"/>
           </w:tcPr>
           <w:p>
             <w:pPr>
@@ -6473,7 +6738,7 @@
                 <w:rFonts w:ascii="Arial" w:hAnsi="Arial"/>
                 <w:sz w:val="20"/>
               </w:rPr>
-              <w:t>prompt</w:t>
+              <w:t>allowedGameIds</w:t>
             </w:r>
           </w:p>
         </w:tc>
@@ -6538,7 +6803,7 @@
                 <w:rFonts w:ascii="Arial" w:hAnsi="Arial"/>
                 <w:sz w:val="20"/>
               </w:rPr>
-              <w:t>acceptedAnswers</w:t>
+              <w:t>prompt</w:t>
             </w:r>
           </w:p>
         </w:tc>
@@ -6603,7 +6868,7 @@
                 <w:rFonts w:ascii="Arial" w:hAnsi="Arial"/>
                 <w:sz w:val="20"/>
               </w:rPr>
-              <w:t>caseSensitive</w:t>
+              <w:t>acceptedAnswers</w:t>
             </w:r>
           </w:p>
         </w:tc>
@@ -6668,7 +6933,7 @@
                 <w:rFonts w:ascii="Arial" w:hAnsi="Arial"/>
                 <w:sz w:val="20"/>
               </w:rPr>
-              <w:t>hint</w:t>
+              <w:t>caseSensitive</w:t>
             </w:r>
           </w:p>
         </w:tc>
@@ -6733,7 +6998,7 @@
                 <w:rFonts w:ascii="Arial" w:hAnsi="Arial"/>
                 <w:sz w:val="20"/>
               </w:rPr>
-              <w:t>explanation</w:t>
+              <w:t>hint</w:t>
             </w:r>
           </w:p>
         </w:tc>
@@ -6798,7 +7063,7 @@
                 <w:rFonts w:ascii="Arial" w:hAnsi="Arial"/>
                 <w:sz w:val="20"/>
               </w:rPr>
-              <w:t>imageFile</w:t>
+              <w:t>explanation</w:t>
             </w:r>
           </w:p>
         </w:tc>
@@ -6863,7 +7128,7 @@
                 <w:rFonts w:ascii="Arial" w:hAnsi="Arial"/>
                 <w:sz w:val="20"/>
               </w:rPr>
-              <w:t>imageAlt</w:t>
+              <w:t>imageFile</w:t>
             </w:r>
           </w:p>
         </w:tc>
@@ -6928,7 +7193,7 @@
                 <w:rFonts w:ascii="Arial" w:hAnsi="Arial"/>
                 <w:sz w:val="20"/>
               </w:rPr>
-              <w:t>audioFile</w:t>
+              <w:t>imageAlt</w:t>
             </w:r>
           </w:p>
         </w:tc>
@@ -6993,7 +7258,7 @@
                 <w:rFonts w:ascii="Arial" w:hAnsi="Arial"/>
                 <w:sz w:val="20"/>
               </w:rPr>
-              <w:t>audioTranscript</w:t>
+              <w:t>audioFile</w:t>
             </w:r>
           </w:p>
         </w:tc>
@@ -7058,7 +7323,7 @@
                 <w:rFonts w:ascii="Arial" w:hAnsi="Arial"/>
                 <w:sz w:val="20"/>
               </w:rPr>
-              <w:t>source</w:t>
+              <w:t>audioTranscript</w:t>
             </w:r>
           </w:p>
         </w:tc>
@@ -7123,6 +7388,71 @@
                 <w:rFonts w:ascii="Arial" w:hAnsi="Arial"/>
                 <w:sz w:val="20"/>
               </w:rPr>
+              <w:t>source</w:t>
+            </w:r>
+          </w:p>
+        </w:tc>
+        <w:tc>
+          <w:tcPr>
+            <w:tcW w:type="dxa" w:w="7301"/>
+            <w:vAlign w:val="center"/>
+            <w:tcBorders>
+              <w:top w:val="single" w:sz="4" w:color="D9D9D9"/>
+              <w:left w:val="single" w:sz="4" w:color="D9D9D9"/>
+              <w:bottom w:val="single" w:sz="4" w:color="D9D9D9"/>
+              <w:right w:val="single" w:sz="4" w:color="D9D9D9"/>
+            </w:tcBorders>
+            <w:tcMar>
+              <w:top w:w="70" w:type="dxa"/>
+              <w:left w:w="70" w:type="dxa"/>
+              <w:bottom w:w="70" w:type="dxa"/>
+              <w:right w:w="70" w:type="dxa"/>
+            </w:tcMar>
+          </w:tcPr>
+          <w:p>
+            <w:pPr>
+              <w:spacing w:after="40" w:before="40"/>
+            </w:pPr>
+            <w:r>
+              <w:rPr>
+                <w:rFonts w:ascii="Arial" w:hAnsi="Arial"/>
+                <w:sz w:val="20"/>
+              </w:rPr>
+            </w:r>
+          </w:p>
+        </w:tc>
+      </w:tr>
+      <w:tr>
+        <w:trPr>
+          <w:cantSplit/>
+        </w:trPr>
+        <w:tc>
+          <w:tcPr>
+            <w:tcW w:type="dxa" w:w="2592"/>
+            <w:vAlign w:val="center"/>
+            <w:tcBorders>
+              <w:top w:val="single" w:sz="4" w:color="D9D9D9"/>
+              <w:left w:val="single" w:sz="4" w:color="D9D9D9"/>
+              <w:bottom w:val="single" w:sz="4" w:color="D9D9D9"/>
+              <w:right w:val="single" w:sz="4" w:color="D9D9D9"/>
+            </w:tcBorders>
+            <w:tcMar>
+              <w:top w:w="70" w:type="dxa"/>
+              <w:left w:w="70" w:type="dxa"/>
+              <w:bottom w:w="70" w:type="dxa"/>
+              <w:right w:w="70" w:type="dxa"/>
+            </w:tcMar>
+            <w:shd w:fill="F1F4F8"/>
+          </w:tcPr>
+          <w:p>
+            <w:pPr>
+              <w:spacing w:after="40" w:before="40"/>
+            </w:pPr>
+            <w:r>
+              <w:rPr>
+                <w:rFonts w:ascii="Arial" w:hAnsi="Arial"/>
+                <w:sz w:val="20"/>
+              </w:rPr>
               <w:t>rights</w:t>
             </w:r>
           </w:p>
@@ -7143,6 +7473,7 @@
               <w:bottom w:w="70" w:type="dxa"/>
               <w:right w:w="70" w:type="dxa"/>
             </w:tcMar>
+            <w:shd w:fill="F1F4F8"/>
           </w:tcPr>
           <w:p>
             <w:pPr>
@@ -7756,7 +8087,7 @@
                 <w:rFonts w:ascii="Arial" w:hAnsi="Arial"/>
                 <w:sz w:val="20"/>
               </w:rPr>
-              <w:t>passageTitle</w:t>
+              <w:t>allowedGameIds</w:t>
             </w:r>
           </w:p>
         </w:tc>
@@ -7821,7 +8152,7 @@
                 <w:rFonts w:ascii="Arial" w:hAnsi="Arial"/>
                 <w:sz w:val="20"/>
               </w:rPr>
-              <w:t>passage</w:t>
+              <w:t>passageTitle</w:t>
             </w:r>
           </w:p>
         </w:tc>
@@ -7886,7 +8217,7 @@
                 <w:rFonts w:ascii="Arial" w:hAnsi="Arial"/>
                 <w:sz w:val="20"/>
               </w:rPr>
-              <w:t>prompt</w:t>
+              <w:t>passage</w:t>
             </w:r>
           </w:p>
         </w:tc>
@@ -7951,7 +8282,7 @@
                 <w:rFonts w:ascii="Arial" w:hAnsi="Arial"/>
                 <w:sz w:val="20"/>
               </w:rPr>
-              <w:t>A</w:t>
+              <w:t>prompt</w:t>
             </w:r>
           </w:p>
         </w:tc>
@@ -8016,7 +8347,7 @@
                 <w:rFonts w:ascii="Arial" w:hAnsi="Arial"/>
                 <w:sz w:val="20"/>
               </w:rPr>
-              <w:t>B</w:t>
+              <w:t>A</w:t>
             </w:r>
           </w:p>
         </w:tc>
@@ -8081,7 +8412,7 @@
                 <w:rFonts w:ascii="Arial" w:hAnsi="Arial"/>
                 <w:sz w:val="20"/>
               </w:rPr>
-              <w:t>C</w:t>
+              <w:t>B</w:t>
             </w:r>
           </w:p>
         </w:tc>
@@ -8146,7 +8477,7 @@
                 <w:rFonts w:ascii="Arial" w:hAnsi="Arial"/>
                 <w:sz w:val="20"/>
               </w:rPr>
-              <w:t>D</w:t>
+              <w:t>C</w:t>
             </w:r>
           </w:p>
         </w:tc>
@@ -8211,7 +8542,7 @@
                 <w:rFonts w:ascii="Arial" w:hAnsi="Arial"/>
                 <w:sz w:val="20"/>
               </w:rPr>
-              <w:t>answer</w:t>
+              <w:t>D</w:t>
             </w:r>
           </w:p>
         </w:tc>
@@ -8276,7 +8607,7 @@
                 <w:rFonts w:ascii="Arial" w:hAnsi="Arial"/>
                 <w:sz w:val="20"/>
               </w:rPr>
-              <w:t>hint</w:t>
+              <w:t>answer</w:t>
             </w:r>
           </w:p>
         </w:tc>
@@ -8341,7 +8672,7 @@
                 <w:rFonts w:ascii="Arial" w:hAnsi="Arial"/>
                 <w:sz w:val="20"/>
               </w:rPr>
-              <w:t>explanation</w:t>
+              <w:t>hint</w:t>
             </w:r>
           </w:p>
         </w:tc>
@@ -8406,7 +8737,7 @@
                 <w:rFonts w:ascii="Arial" w:hAnsi="Arial"/>
                 <w:sz w:val="20"/>
               </w:rPr>
-              <w:t>imageFile</w:t>
+              <w:t>explanation</w:t>
             </w:r>
           </w:p>
         </w:tc>
@@ -8471,7 +8802,7 @@
                 <w:rFonts w:ascii="Arial" w:hAnsi="Arial"/>
                 <w:sz w:val="20"/>
               </w:rPr>
-              <w:t>imageAlt</w:t>
+              <w:t>imageFile</w:t>
             </w:r>
           </w:p>
         </w:tc>
@@ -8536,7 +8867,7 @@
                 <w:rFonts w:ascii="Arial" w:hAnsi="Arial"/>
                 <w:sz w:val="20"/>
               </w:rPr>
-              <w:t>audioFile</w:t>
+              <w:t>imageAlt</w:t>
             </w:r>
           </w:p>
         </w:tc>
@@ -8601,7 +8932,7 @@
                 <w:rFonts w:ascii="Arial" w:hAnsi="Arial"/>
                 <w:sz w:val="20"/>
               </w:rPr>
-              <w:t>audioTranscript</w:t>
+              <w:t>audioFile</w:t>
             </w:r>
           </w:p>
         </w:tc>
@@ -8666,7 +8997,7 @@
                 <w:rFonts w:ascii="Arial" w:hAnsi="Arial"/>
                 <w:sz w:val="20"/>
               </w:rPr>
-              <w:t>source</w:t>
+              <w:t>audioTranscript</w:t>
             </w:r>
           </w:p>
         </w:tc>
@@ -8731,6 +9062,71 @@
                 <w:rFonts w:ascii="Arial" w:hAnsi="Arial"/>
                 <w:sz w:val="20"/>
               </w:rPr>
+              <w:t>source</w:t>
+            </w:r>
+          </w:p>
+        </w:tc>
+        <w:tc>
+          <w:tcPr>
+            <w:tcW w:type="dxa" w:w="7301"/>
+            <w:vAlign w:val="center"/>
+            <w:tcBorders>
+              <w:top w:val="single" w:sz="4" w:color="D9D9D9"/>
+              <w:left w:val="single" w:sz="4" w:color="D9D9D9"/>
+              <w:bottom w:val="single" w:sz="4" w:color="D9D9D9"/>
+              <w:right w:val="single" w:sz="4" w:color="D9D9D9"/>
+            </w:tcBorders>
+            <w:tcMar>
+              <w:top w:w="70" w:type="dxa"/>
+              <w:left w:w="70" w:type="dxa"/>
+              <w:bottom w:w="70" w:type="dxa"/>
+              <w:right w:w="70" w:type="dxa"/>
+            </w:tcMar>
+            <w:shd w:fill="F1F4F8"/>
+          </w:tcPr>
+          <w:p>
+            <w:pPr>
+              <w:spacing w:after="40" w:before="40"/>
+            </w:pPr>
+            <w:r>
+              <w:rPr>
+                <w:rFonts w:ascii="Arial" w:hAnsi="Arial"/>
+                <w:sz w:val="20"/>
+              </w:rPr>
+            </w:r>
+          </w:p>
+        </w:tc>
+      </w:tr>
+      <w:tr>
+        <w:trPr>
+          <w:cantSplit/>
+        </w:trPr>
+        <w:tc>
+          <w:tcPr>
+            <w:tcW w:type="dxa" w:w="2592"/>
+            <w:vAlign w:val="center"/>
+            <w:tcBorders>
+              <w:top w:val="single" w:sz="4" w:color="D9D9D9"/>
+              <w:left w:val="single" w:sz="4" w:color="D9D9D9"/>
+              <w:bottom w:val="single" w:sz="4" w:color="D9D9D9"/>
+              <w:right w:val="single" w:sz="4" w:color="D9D9D9"/>
+            </w:tcBorders>
+            <w:tcMar>
+              <w:top w:w="70" w:type="dxa"/>
+              <w:left w:w="70" w:type="dxa"/>
+              <w:bottom w:w="70" w:type="dxa"/>
+              <w:right w:w="70" w:type="dxa"/>
+            </w:tcMar>
+          </w:tcPr>
+          <w:p>
+            <w:pPr>
+              <w:spacing w:after="40" w:before="40"/>
+            </w:pPr>
+            <w:r>
+              <w:rPr>
+                <w:rFonts w:ascii="Arial" w:hAnsi="Arial"/>
+                <w:sz w:val="20"/>
+              </w:rPr>
               <w:t>rights</w:t>
             </w:r>
           </w:p>
@@ -8751,7 +9147,6 @@
               <w:bottom w:w="70" w:type="dxa"/>
               <w:right w:w="70" w:type="dxa"/>
             </w:tcMar>
-            <w:shd w:fill="F1F4F8"/>
           </w:tcPr>
           <w:p>
             <w:pPr>
@@ -9365,7 +9760,7 @@
                 <w:rFonts w:ascii="Arial" w:hAnsi="Arial"/>
                 <w:sz w:val="20"/>
               </w:rPr>
-              <w:t>prompt</w:t>
+              <w:t>allowedGameIds</w:t>
             </w:r>
           </w:p>
         </w:tc>
@@ -9430,7 +9825,7 @@
                 <w:rFonts w:ascii="Arial" w:hAnsi="Arial"/>
                 <w:sz w:val="20"/>
               </w:rPr>
-              <w:t>A</w:t>
+              <w:t>prompt</w:t>
             </w:r>
           </w:p>
         </w:tc>
@@ -9495,7 +9890,7 @@
                 <w:rFonts w:ascii="Arial" w:hAnsi="Arial"/>
                 <w:sz w:val="20"/>
               </w:rPr>
-              <w:t>B</w:t>
+              <w:t>A</w:t>
             </w:r>
           </w:p>
         </w:tc>
@@ -9560,7 +9955,7 @@
                 <w:rFonts w:ascii="Arial" w:hAnsi="Arial"/>
                 <w:sz w:val="20"/>
               </w:rPr>
-              <w:t>C</w:t>
+              <w:t>B</w:t>
             </w:r>
           </w:p>
         </w:tc>
@@ -9625,7 +10020,7 @@
                 <w:rFonts w:ascii="Arial" w:hAnsi="Arial"/>
                 <w:sz w:val="20"/>
               </w:rPr>
-              <w:t>D</w:t>
+              <w:t>C</w:t>
             </w:r>
           </w:p>
         </w:tc>
@@ -9690,7 +10085,7 @@
                 <w:rFonts w:ascii="Arial" w:hAnsi="Arial"/>
                 <w:sz w:val="20"/>
               </w:rPr>
-              <w:t>answer</w:t>
+              <w:t>D</w:t>
             </w:r>
           </w:p>
         </w:tc>
@@ -9755,7 +10150,7 @@
                 <w:rFonts w:ascii="Arial" w:hAnsi="Arial"/>
                 <w:sz w:val="20"/>
               </w:rPr>
-              <w:t>hint</w:t>
+              <w:t>answer</w:t>
             </w:r>
           </w:p>
         </w:tc>
@@ -9820,7 +10215,7 @@
                 <w:rFonts w:ascii="Arial" w:hAnsi="Arial"/>
                 <w:sz w:val="20"/>
               </w:rPr>
-              <w:t>explanation</w:t>
+              <w:t>hint</w:t>
             </w:r>
           </w:p>
         </w:tc>
@@ -9885,7 +10280,7 @@
                 <w:rFonts w:ascii="Arial" w:hAnsi="Arial"/>
                 <w:sz w:val="20"/>
               </w:rPr>
-              <w:t>imageFile</w:t>
+              <w:t>explanation</w:t>
             </w:r>
           </w:p>
         </w:tc>
@@ -9950,7 +10345,7 @@
                 <w:rFonts w:ascii="Arial" w:hAnsi="Arial"/>
                 <w:sz w:val="20"/>
               </w:rPr>
-              <w:t>imageAlt</w:t>
+              <w:t>imageFile</w:t>
             </w:r>
           </w:p>
         </w:tc>
@@ -10015,7 +10410,7 @@
                 <w:rFonts w:ascii="Arial" w:hAnsi="Arial"/>
                 <w:sz w:val="20"/>
               </w:rPr>
-              <w:t>audioFile</w:t>
+              <w:t>imageAlt</w:t>
             </w:r>
           </w:p>
         </w:tc>
@@ -10080,7 +10475,7 @@
                 <w:rFonts w:ascii="Arial" w:hAnsi="Arial"/>
                 <w:sz w:val="20"/>
               </w:rPr>
-              <w:t>audioTranscript</w:t>
+              <w:t>audioFile</w:t>
             </w:r>
           </w:p>
         </w:tc>
@@ -10145,7 +10540,7 @@
                 <w:rFonts w:ascii="Arial" w:hAnsi="Arial"/>
                 <w:sz w:val="20"/>
               </w:rPr>
-              <w:t>source</w:t>
+              <w:t>audioTranscript</w:t>
             </w:r>
           </w:p>
         </w:tc>
@@ -10210,6 +10605,71 @@
                 <w:rFonts w:ascii="Arial" w:hAnsi="Arial"/>
                 <w:sz w:val="20"/>
               </w:rPr>
+              <w:t>source</w:t>
+            </w:r>
+          </w:p>
+        </w:tc>
+        <w:tc>
+          <w:tcPr>
+            <w:tcW w:type="dxa" w:w="7301"/>
+            <w:vAlign w:val="center"/>
+            <w:tcBorders>
+              <w:top w:val="single" w:sz="4" w:color="D9D9D9"/>
+              <w:left w:val="single" w:sz="4" w:color="D9D9D9"/>
+              <w:bottom w:val="single" w:sz="4" w:color="D9D9D9"/>
+              <w:right w:val="single" w:sz="4" w:color="D9D9D9"/>
+            </w:tcBorders>
+            <w:tcMar>
+              <w:top w:w="70" w:type="dxa"/>
+              <w:left w:w="70" w:type="dxa"/>
+              <w:bottom w:w="70" w:type="dxa"/>
+              <w:right w:w="70" w:type="dxa"/>
+            </w:tcMar>
+            <w:shd w:fill="F1F4F8"/>
+          </w:tcPr>
+          <w:p>
+            <w:pPr>
+              <w:spacing w:after="40" w:before="40"/>
+            </w:pPr>
+            <w:r>
+              <w:rPr>
+                <w:rFonts w:ascii="Arial" w:hAnsi="Arial"/>
+                <w:sz w:val="20"/>
+              </w:rPr>
+            </w:r>
+          </w:p>
+        </w:tc>
+      </w:tr>
+      <w:tr>
+        <w:trPr>
+          <w:cantSplit/>
+        </w:trPr>
+        <w:tc>
+          <w:tcPr>
+            <w:tcW w:type="dxa" w:w="2592"/>
+            <w:vAlign w:val="center"/>
+            <w:tcBorders>
+              <w:top w:val="single" w:sz="4" w:color="D9D9D9"/>
+              <w:left w:val="single" w:sz="4" w:color="D9D9D9"/>
+              <w:bottom w:val="single" w:sz="4" w:color="D9D9D9"/>
+              <w:right w:val="single" w:sz="4" w:color="D9D9D9"/>
+            </w:tcBorders>
+            <w:tcMar>
+              <w:top w:w="70" w:type="dxa"/>
+              <w:left w:w="70" w:type="dxa"/>
+              <w:bottom w:w="70" w:type="dxa"/>
+              <w:right w:w="70" w:type="dxa"/>
+            </w:tcMar>
+          </w:tcPr>
+          <w:p>
+            <w:pPr>
+              <w:spacing w:after="40" w:before="40"/>
+            </w:pPr>
+            <w:r>
+              <w:rPr>
+                <w:rFonts w:ascii="Arial" w:hAnsi="Arial"/>
+                <w:sz w:val="20"/>
+              </w:rPr>
               <w:t>rights</w:t>
             </w:r>
           </w:p>
@@ -10230,7 +10690,6 @@
               <w:bottom w:w="70" w:type="dxa"/>
               <w:right w:w="70" w:type="dxa"/>
             </w:tcMar>
-            <w:shd w:fill="F1F4F8"/>
           </w:tcPr>
           <w:p>
             <w:pPr>
@@ -10844,7 +11303,7 @@
                 <w:rFonts w:ascii="Arial" w:hAnsi="Arial"/>
                 <w:sz w:val="20"/>
               </w:rPr>
-              <w:t>prompt</w:t>
+              <w:t>allowedGameIds</w:t>
             </w:r>
           </w:p>
         </w:tc>
@@ -10909,7 +11368,7 @@
                 <w:rFonts w:ascii="Arial" w:hAnsi="Arial"/>
                 <w:sz w:val="20"/>
               </w:rPr>
-              <w:t>acceptedAnswers</w:t>
+              <w:t>prompt</w:t>
             </w:r>
           </w:p>
         </w:tc>
@@ -10974,7 +11433,7 @@
                 <w:rFonts w:ascii="Arial" w:hAnsi="Arial"/>
                 <w:sz w:val="20"/>
               </w:rPr>
-              <w:t>caseSensitive</w:t>
+              <w:t>acceptedAnswers</w:t>
             </w:r>
           </w:p>
         </w:tc>
@@ -11039,7 +11498,7 @@
                 <w:rFonts w:ascii="Arial" w:hAnsi="Arial"/>
                 <w:sz w:val="20"/>
               </w:rPr>
-              <w:t>hint</w:t>
+              <w:t>caseSensitive</w:t>
             </w:r>
           </w:p>
         </w:tc>
@@ -11104,7 +11563,7 @@
                 <w:rFonts w:ascii="Arial" w:hAnsi="Arial"/>
                 <w:sz w:val="20"/>
               </w:rPr>
-              <w:t>explanation</w:t>
+              <w:t>hint</w:t>
             </w:r>
           </w:p>
         </w:tc>
@@ -11169,7 +11628,7 @@
                 <w:rFonts w:ascii="Arial" w:hAnsi="Arial"/>
                 <w:sz w:val="20"/>
               </w:rPr>
-              <w:t>imageFile</w:t>
+              <w:t>explanation</w:t>
             </w:r>
           </w:p>
         </w:tc>
@@ -11234,7 +11693,7 @@
                 <w:rFonts w:ascii="Arial" w:hAnsi="Arial"/>
                 <w:sz w:val="20"/>
               </w:rPr>
-              <w:t>imageAlt</w:t>
+              <w:t>imageFile</w:t>
             </w:r>
           </w:p>
         </w:tc>
@@ -11299,7 +11758,7 @@
                 <w:rFonts w:ascii="Arial" w:hAnsi="Arial"/>
                 <w:sz w:val="20"/>
               </w:rPr>
-              <w:t>audioFile</w:t>
+              <w:t>imageAlt</w:t>
             </w:r>
           </w:p>
         </w:tc>
@@ -11364,7 +11823,7 @@
                 <w:rFonts w:ascii="Arial" w:hAnsi="Arial"/>
                 <w:sz w:val="20"/>
               </w:rPr>
-              <w:t>audioTranscript</w:t>
+              <w:t>audioFile</w:t>
             </w:r>
           </w:p>
         </w:tc>
@@ -11429,7 +11888,7 @@
                 <w:rFonts w:ascii="Arial" w:hAnsi="Arial"/>
                 <w:sz w:val="20"/>
               </w:rPr>
-              <w:t>source</w:t>
+              <w:t>audioTranscript</w:t>
             </w:r>
           </w:p>
         </w:tc>
@@ -11494,6 +11953,71 @@
                 <w:rFonts w:ascii="Arial" w:hAnsi="Arial"/>
                 <w:sz w:val="20"/>
               </w:rPr>
+              <w:t>source</w:t>
+            </w:r>
+          </w:p>
+        </w:tc>
+        <w:tc>
+          <w:tcPr>
+            <w:tcW w:type="dxa" w:w="7301"/>
+            <w:vAlign w:val="center"/>
+            <w:tcBorders>
+              <w:top w:val="single" w:sz="4" w:color="D9D9D9"/>
+              <w:left w:val="single" w:sz="4" w:color="D9D9D9"/>
+              <w:bottom w:val="single" w:sz="4" w:color="D9D9D9"/>
+              <w:right w:val="single" w:sz="4" w:color="D9D9D9"/>
+            </w:tcBorders>
+            <w:tcMar>
+              <w:top w:w="70" w:type="dxa"/>
+              <w:left w:w="70" w:type="dxa"/>
+              <w:bottom w:w="70" w:type="dxa"/>
+              <w:right w:w="70" w:type="dxa"/>
+            </w:tcMar>
+          </w:tcPr>
+          <w:p>
+            <w:pPr>
+              <w:spacing w:after="40" w:before="40"/>
+            </w:pPr>
+            <w:r>
+              <w:rPr>
+                <w:rFonts w:ascii="Arial" w:hAnsi="Arial"/>
+                <w:sz w:val="20"/>
+              </w:rPr>
+            </w:r>
+          </w:p>
+        </w:tc>
+      </w:tr>
+      <w:tr>
+        <w:trPr>
+          <w:cantSplit/>
+        </w:trPr>
+        <w:tc>
+          <w:tcPr>
+            <w:tcW w:type="dxa" w:w="2592"/>
+            <w:vAlign w:val="center"/>
+            <w:tcBorders>
+              <w:top w:val="single" w:sz="4" w:color="D9D9D9"/>
+              <w:left w:val="single" w:sz="4" w:color="D9D9D9"/>
+              <w:bottom w:val="single" w:sz="4" w:color="D9D9D9"/>
+              <w:right w:val="single" w:sz="4" w:color="D9D9D9"/>
+            </w:tcBorders>
+            <w:tcMar>
+              <w:top w:w="70" w:type="dxa"/>
+              <w:left w:w="70" w:type="dxa"/>
+              <w:bottom w:w="70" w:type="dxa"/>
+              <w:right w:w="70" w:type="dxa"/>
+            </w:tcMar>
+            <w:shd w:fill="F1F4F8"/>
+          </w:tcPr>
+          <w:p>
+            <w:pPr>
+              <w:spacing w:after="40" w:before="40"/>
+            </w:pPr>
+            <w:r>
+              <w:rPr>
+                <w:rFonts w:ascii="Arial" w:hAnsi="Arial"/>
+                <w:sz w:val="20"/>
+              </w:rPr>
               <w:t>rights</w:t>
             </w:r>
           </w:p>
@@ -11514,6 +12038,7 @@
               <w:bottom w:w="70" w:type="dxa"/>
               <w:right w:w="70" w:type="dxa"/>
             </w:tcMar>
+            <w:shd w:fill="F1F4F8"/>
           </w:tcPr>
           <w:p>
             <w:pPr>

</xml_diff>